<commit_message>
fix(word): mojibake accenti italiani in template e export OOXML
Corregge Conformita/Opportunita corrotti nei template ISO9001, ISO45001 e VerbaleVisita, estende fixWordXmlMojibake a runtime e aggiunge test Vitest.

Co-authored-by: Cursor <cursoragent@cursor.com>
</commit_message>
<xml_diff>
--- a/app/public/templates/ISO45001-audit-report.docx
+++ b/app/public/templates/ISO45001-audit-report.docx
@@ -1207,15 +1207,7 @@
                 <w:b/>
                 <w:bCs/>
               </w:rPr>
-              <w:t>ConformitÃ</w:t>
-            </w:r>
-            <w:proofErr w:type="spellEnd"/>
-            <w:r>
-              <w:rPr>
-                <w:b/>
-                <w:bCs/>
-              </w:rPr>
-              <w:t>  (</w:t>
+              <w:t>Conformità (</w:t>
             </w:r>
             <w:proofErr w:type="gramEnd"/>
             <w:r>
@@ -1361,15 +1353,7 @@
                 <w:b/>
                 <w:bCs/>
               </w:rPr>
-              <w:t>OpportunitÃ</w:t>
-            </w:r>
-            <w:proofErr w:type="spellEnd"/>
-            <w:r>
-              <w:rPr>
-                <w:b/>
-                <w:bCs/>
-              </w:rPr>
-              <w:t>  di</w:t>
+              <w:t>Opportunità di</w:t>
             </w:r>
             <w:proofErr w:type="gramEnd"/>
             <w:r>

</xml_diff>